<commit_message>
updated frontend and backend all changes done
</commit_message>
<xml_diff>
--- a/MCERT-frontend/public/templates/mclerts-template.docx
+++ b/MCERT-frontend/public/templates/mclerts-template.docx
@@ -3631,64 +3631,6 @@
       </w:r>
     </w:p>
     <w:bookmarkEnd w:id="3"/>
-    <w:p>
-      <w:pPr>
-        <w:rPr>
-          <w:rFonts w:ascii="Calibri" w:hAnsi="Calibri" w:cs="Arial"/>
-        </w:rPr>
-      </w:pPr>
-      <w:r>
-        <w:rPr>
-          <w:rFonts w:ascii="Calibri" w:hAnsi="Calibri" w:cs="Arial"/>
-        </w:rPr>
-        <w:br w:type="page"/>
-      </w:r>
-    </w:p>
-    <w:p>
-      <w:pPr>
-        <w:rPr>
-          <w:rFonts w:ascii="Calibri" w:hAnsi="Calibri" w:cs="Calibri"/>
-        </w:rPr>
-      </w:pPr>
-      <w:r>
-        <w:rPr>
-          <w:rFonts w:asciiTheme="minorHAnsi" w:hAnsiTheme="minorHAnsi" w:cstheme="minorHAnsi"/>
-          <w:b/>
-          <w:sz w:val="24"/>
-          <w:szCs w:val="24"/>
-          <w:u w:val="single"/>
-        </w:rPr>
-        <w:lastRenderedPageBreak/>
-        <w:t xml:space="preserve">Site process &amp; schematic diagram </w:t>
-      </w:r>
-      <w:r>
-        <w:rPr>
-          <w:rFonts w:asciiTheme="minorHAnsi" w:hAnsiTheme="minorHAnsi" w:cstheme="minorHAnsi"/>
-          <w:b/>
-          <w:sz w:val="24"/>
-          <w:szCs w:val="24"/>
-          <w:u w:val="single"/>
-        </w:rPr>
-        <w:t>3</w:t>
-      </w:r>
-      <w:r>
-        <w:rPr>
-          <w:rFonts w:asciiTheme="minorHAnsi" w:hAnsiTheme="minorHAnsi" w:cstheme="minorHAnsi"/>
-          <w:b/>
-          <w:sz w:val="24"/>
-          <w:szCs w:val="24"/>
-          <w:u w:val="single"/>
-        </w:rPr>
-        <w:t xml:space="preserve">.0 </w:t>
-      </w:r>
-    </w:p>
-    <w:p>
-      <w:pPr>
-        <w:rPr>
-          <w:rFonts w:ascii="Calibri" w:hAnsi="Calibri" w:cs="Calibri"/>
-        </w:rPr>
-      </w:pPr>
-    </w:p>
     <w:p>
       <w:pPr>
         <w:jc w:val="center"/>

</xml_diff>